<commit_message>
DCA-CATCHUP-2 executed: book the VEEV buy and SPMO sale, close the FZFXX lot
VEEV 100 sh at $283.25 ($28,325.00, JT ULTRA) and 30 SPMO sold 10/6 at $153.54 (one lot,
about $197 realized) booked in one pass: Current Positions (cash rows, SPMO 100 -> 70, VEEV
row 24 via cp_tab, JT Excluding-Cash 7.2% -> 6.3%, Chase VMFXX $27,966.40 and core sweep
$20,408.02, both confirmed by Alan from the Chase page), Performance Tracking (exited SPMO
lot, VEEV System lot, FZFXX lot closed 10/1 at 1,174.01 sh), Price History column for VEEV,
Monitor (VEEV Owned), Process Checklist (all 11 DCA-CATCHUP-2 steps), Schema Reference C14,
Drawdown Log 10/6 entry, Journal rows 104-105. Entry pack v2 refreshed 10/7.

Audit 69/71 (the two standing scoring_verification findings), 744 tests, database in sync,
workbook opened clean in real Excel (not saved).

Co-Authored-By: Claude Sonnet 5.5 <noreply@anthropic.com>
</commit_message>
<xml_diff>
--- a/DCA_prep-executions/10-7-26_DCA_Entry_Pack_v2.docx
+++ b/DCA_prep-executions/10-7-26_DCA_Entry_Pack_v2.docx
@@ -28,7 +28,7 @@
           <w:color w:val="595959"/>
           <w:sz w:val="19"/>
         </w:rPr>
-        <w:t>Built 10/6/26 at 1:35 PM ET from your replies (VEEV only, Moat 4, Rule 14 trailing, SLB's rows kept as a record) and the Fidelity 3711 history. Prices are 10/6 quotes at that time (VEEV $284.04, portfolio $718.4K); they move with the open, so I re-run every number below before you place the order. These are your rulebook's outputs on your data, not a recommendation; the calls are yours. Supersedes the DRAFT pack (which keeps the SLB and Moat detail).</w:t>
+        <w:t>Refreshed 10/7/26 at 8:03 AM ET, before the open, from your decisions (VEEV only, Moat 4, Rule 14 trailing, SLB's rows kept as a record) and the Fidelity 3711 history. Portfolio at the 10/6 closes ($718.5K; VEEV closed $283.50, pre-market $282.00 on thin volume at 7:41 am); prices move with the open, so use the order-day card (section 2). These are your rulebook's outputs on your data, not a recommendation; the calls are yours. Supersedes the DRAFT pack (which keeps the SLB and Moat detail).</w:t>
       </w:r>
     </w:p>
     <w:tbl>
@@ -113,7 +113,7 @@
                 <w:b w:val="0"/>
                 <w:sz w:val="21"/>
               </w:rPr>
-              <w:t>• The size cap (Moat 4, STRONG BUY, Fed −1% = 4%) is ≈ $28.7K, so 100 shares stay inside it up to $287.34; above that, buy 99 or fewer (section 2).</w:t>
+              <w:t>• The size cap (Moat 4, STRONG BUY, Fed −1% = 4%) is ≈ $28.7K, so 100 shares stay inside it up to $287.40; above that, buy 99 or fewer (section 2).</w:t>
             </w:r>
           </w:p>
           <w:p>
@@ -126,7 +126,7 @@
                 <w:b w:val="0"/>
                 <w:sz w:val="21"/>
               </w:rPr>
-              <w:t>• Already in the workbook (uncommitted): Entry Checklist and Implied-Return rows (now including GE and NFLX), the corrected Rule 14 column, Journal rows 100–103, Open Items. Still to do after the fill: Current Positions, Performance Tracking, Drawdown Log (section 6).</w:t>
+              <w:t>• Already in the workbook (committed 10/6 except the Drawdown Log entry): Entry Checklist and Implied-Return rows (now including GE and NFLX), the corrected Rule 14 column, Journal rows 100–103, Open Items, and the 10/6 Drawdown Log entry (posted this morning). Still to do after the fill: Current Positions and Performance Tracking (section 6).</w:t>
             </w:r>
           </w:p>
         </w:tc>
@@ -671,7 +671,7 @@
                 <w:b w:val="0"/>
                 <w:sz w:val="18"/>
               </w:rPr>
-              <w:t>100 shares ≈ $28.4K = 4.0% of the portfolio.</w:t>
+              <w:t>100 shares ≈ $28.4K = 3.9% of the portfolio.</w:t>
             </w:r>
           </w:p>
         </w:tc>
@@ -733,7 +733,7 @@
                 <w:b w:val="0"/>
                 <w:sz w:val="18"/>
               </w:rPr>
-              <w:t>Healthcare 4.5% → 8.5%. (Technology is 27.7% at market, over the cap by drift: it blocks Technology adds, not this.)</w:t>
+              <w:t>Healthcare 4.5% → 8.5%. (Technology is 27.6% at market, over the cap by drift: it blocks Technology adds, not this.)</w:t>
             </w:r>
           </w:p>
         </w:tc>
@@ -919,7 +919,7 @@
                 <w:b w:val="0"/>
                 <w:sz w:val="18"/>
               </w:rPr>
-              <w:t>Initial 5% less 1% for the Fed-tightening overlay (P/FCF above 40x) = 4% ≈ $28,734. (The overlay switches off below ≈ $282.7, where P/FCF is 40.0x.)</w:t>
+              <w:t>Initial 5% less 1% for the Fed-tightening overlay (P/FCF above 40x) = 4% ≈ $28,740. (The overlay switches off below ≈ $282.7, where P/FCF is 40.0x.)</w:t>
             </w:r>
           </w:p>
         </w:tc>
@@ -981,7 +981,7 @@
                 <w:b w:val="0"/>
                 <w:sz w:val="18"/>
               </w:rPr>
-              <w:t>Drawdown regime Normal (flow-adjusted $753.4K against the 9/4 peak of $751.2K); S&amp;P 500 above its prior record close (7,836 intraday vs 7,799), so the baseline tranche with no multiplier.</w:t>
+              <w:t>Drawdown regime Normal: the 10/6 entry (flow-adjusted $753.5K, Drawdown Log row 6) is a new running peak. S&amp;P 500 closed 10/6 at a record 7,818.93 (prior record close 7,798.99): baseline tranche, no multiplier. Fed-tightening overlay still active; curve not inverted; HY under 600.</w:t>
             </w:r>
           </w:p>
         </w:tc>
@@ -1022,7 +1022,7 @@
                 <w:b w:val="0"/>
                 <w:sz w:val="18"/>
               </w:rPr>
-              <w:t>no flag</w:t>
+              <w:t>note</w:t>
             </w:r>
           </w:p>
         </w:tc>
@@ -1040,7 +1040,7 @@
                 <w:b w:val="0"/>
                 <w:sz w:val="18"/>
               </w:rPr>
-              <w:t>No open-market purchases; $3.3M of sales in 45 days (2 of 3 plan-marked); Fidelity score Bullish 8.2 (10/5 scan).</w:t>
+              <w:t>No open-market purchases (no sizing bonus). New since 10/5: EVP Sales Daniel Rizzo sold 4,841 sh ($1.34M, 36% of his holding, not under a 10b5-1 plan); a Form 144 filed 10/5 for Thomas Schwenger, listed as a Former Officer (President and Chief Customer Officer until recently), proposes selling 132,751 sh (about $37.1M, option exercise and sale). I found no company announcement of a departure. No hard rule turns on insider sales; Management scored 4 with 'some senior departures' as a minor concern (at Management 3 the composite would sit right on the 80.0 STRONG BUY line). Fidelity score Bullish 8.0; pre-market news is routine product items.</w:t>
             </w:r>
           </w:p>
         </w:tc>
@@ -1479,7 +1479,7 @@
                 <w:b/>
                 <w:sz w:val="18"/>
               </w:rPr>
-              <w:t>$284.04 (now)</w:t>
+              <w:t>$283.50 (now)</w:t>
             </w:r>
           </w:p>
         </w:tc>
@@ -1498,7 +1498,7 @@
                 <w:b w:val="0"/>
                 <w:sz w:val="18"/>
               </w:rPr>
-              <w:t>$28,404</w:t>
+              <w:t>$28,350</w:t>
             </w:r>
           </w:p>
         </w:tc>
@@ -1717,7 +1717,7 @@
                 <w:b/>
                 <w:sz w:val="18"/>
               </w:rPr>
-              <w:t>$287.34 (4% cap)</w:t>
+              <w:t>$287.40 (4% cap)</w:t>
             </w:r>
           </w:p>
         </w:tc>
@@ -1736,7 +1736,7 @@
                 <w:b w:val="0"/>
                 <w:sz w:val="18"/>
               </w:rPr>
-              <w:t>$28,734</w:t>
+              <w:t>$28,740</w:t>
             </w:r>
           </w:p>
         </w:tc>
@@ -2181,7 +2181,7 @@
           <w:color w:val="595959"/>
           <w:sz w:val="19"/>
         </w:rPr>
-        <w:t>The cap moves with the portfolio (4% of $718.4K today). Rule 14 on the ruled trailing basis needs P/FCF ≤ 50x, i.e. any price up to $353.</w:t>
+        <w:t>The cap moves with the portfolio (4% of $718.5K today). Rule 14 on the ruled trailing basis needs P/FCF ≤ 50x, i.e. any price up to $353.</w:t>
       </w:r>
     </w:p>
     <w:p>
@@ -2560,7 +2560,7 @@
                 <w:b/>
                 <w:sz w:val="18"/>
               </w:rPr>
-              <w:t>+ SPMO sale 10/6: 30 sh at $153.54, net of a $0.10 fee (settles 10/7)</w:t>
+              <w:t>+ SPMO sale 10/6: 30 sh at $153.54, net of a $0.10 fee</w:t>
             </w:r>
           </w:p>
         </w:tc>
@@ -2598,7 +2598,7 @@
                 <w:b w:val="0"/>
                 <w:sz w:val="18"/>
               </w:rPr>
-              <w:t>slate estimated $4,608</w:t>
+              <w:t>journaled to cash at settlement, 10/7; no pending orders</w:t>
             </w:r>
           </w:p>
         </w:tc>
@@ -2688,7 +2688,7 @@
           <w:i w:val="0"/>
           <w:sz w:val="19"/>
         </w:rPr>
-        <w:t>Drawdown Log: net external withdrawals since the 9/4 peak are $16,500 (9/9) + $20,000 (9/14) + $19.99 (9/15 PayPal) + $15,000 (10/2) less the $16,500 that entered Chase on 9/8 = $35,019.99 ($20,019.99 was added back in the 9/30 entry; the 10/2 $15,000 is new). On that basis the portfolio is $753.4K against a peak of $751.2K: a new high, regime Normal. I post the 10/6 entry on the close.</w:t>
+        <w:t>Drawdown Log: net external withdrawals since the 9/4 peak are $16,500 (9/9) + $20,000 (9/14) + $19.99 (9/15 PayPal) + $15,000 (10/2) less the $16,500 that entered Chase on 9/8 = $35,019.99 ($20,019.99 was added back in the 9/30 entry; the 10/2 $15,000 is new). On that basis the portfolio is $753.5K against the 9/4 peak of $751.2K: a new high, regime Normal. Posted this morning as the 10/6 entry ($753,520.32; Drawdown Log row 6).</w:t>
       </w:r>
     </w:p>
     <w:p>
@@ -3166,7 +3166,7 @@
                 <w:b/>
                 <w:sz w:val="18"/>
               </w:rPr>
-              <w:t>P/FCF at $284.04</w:t>
+              <w:t>P/FCF at $283.50</w:t>
             </w:r>
           </w:p>
         </w:tc>
@@ -3204,7 +3204,7 @@
                 <w:b w:val="0"/>
                 <w:sz w:val="18"/>
               </w:rPr>
-              <w:t>40.2x</w:t>
+              <w:t>40.1x</w:t>
             </w:r>
           </w:p>
         </w:tc>
@@ -3331,7 +3331,7 @@
           <w:color w:val="1F3864"/>
           <w:sz w:val="24"/>
         </w:rPr>
-        <w:t>5. Already written to the live workbook tonight (not committed)</w:t>
+        <w:t>5. Already in the live workbook (committed 10/6; this morning's Drawdown Log entry is not yet)</w:t>
       </w:r>
     </w:p>
     <w:p>
@@ -3438,7 +3438,7 @@
           <w:rFonts w:ascii="Calibri" w:hAnsi="Calibri" w:eastAsia="Calibri" w:cs="Calibri"/>
           <w:sz w:val="19"/>
         </w:rPr>
-        <w:t>•  Performance Tracking: VEEV System lot; the SPMO partial sale as a sold baseline lot plus a rebase. Then `landry prices add VEEV`, Monitor Category → Owned plus `monitor stamp`, the Drawdown Log entry, a Journal entry for the fills, and the DCA-CATCHUP-2 rows of the Process Checklist.</w:t>
+        <w:t>•  Performance Tracking: VEEV System lot; the SPMO partial sale as a sold baseline lot plus a rebase. Then `landry prices add VEEV`, Monitor Category → Owned plus `monitor stamp`, a Journal entry for the fills, and the DCA-CATCHUP-2 rows of the Process Checklist.</w:t>
       </w:r>
     </w:p>
     <w:p>

</xml_diff>